<commit_message>
Update web reports - 2026-02-20 20:45:01
</commit_message>
<xml_diff>
--- a/Ohio Hospital Project Cost Tracking Report.docx
+++ b/Ohio Hospital Project Cost Tracking Report.docx
@@ -16,7 +16,7 @@
         <w:jc w:val="center"/>
       </w:pPr>
       <w:r>
-        <w:t>Report Date: January 20, 2026</w:t>
+        <w:t>Report Date: January 29, 2026</w:t>
       </w:r>
     </w:p>
     <w:p>
@@ -599,7 +599,7 @@
                 <w:b/>
                 <w:sz w:val="18"/>
               </w:rPr>
-              <w:t>09/02/25 - 01/26/26</w:t>
+              <w:t>09/02/25 - 02/13/26</w:t>
             </w:r>
           </w:p>
         </w:tc>
@@ -616,7 +616,7 @@
                 <w:rFonts w:ascii="Calibri" w:hAnsi="Calibri"/>
                 <w:sz w:val="18"/>
               </w:rPr>
-              <w:t>01/27/26 - 08/14/26</w:t>
+              <w:t>02/16/26 - 09/03/26</w:t>
             </w:r>
           </w:p>
         </w:tc>
@@ -633,7 +633,7 @@
                 <w:rFonts w:ascii="Calibri" w:hAnsi="Calibri"/>
                 <w:sz w:val="18"/>
               </w:rPr>
-              <w:t>08/17/26 - 09/07/26</w:t>
+              <w:t>09/04/26 - 09/25/26</w:t>
             </w:r>
           </w:p>
         </w:tc>
@@ -650,7 +650,7 @@
                 <w:rFonts w:ascii="Calibri" w:hAnsi="Calibri"/>
                 <w:sz w:val="18"/>
               </w:rPr>
-              <w:t>08/17/26 - 10/09/26</w:t>
+              <w:t>09/04/26 - 10/29/26</w:t>
             </w:r>
           </w:p>
         </w:tc>
@@ -667,7 +667,7 @@
                 <w:rFonts w:ascii="Calibri" w:hAnsi="Calibri"/>
                 <w:sz w:val="18"/>
               </w:rPr>
-              <w:t>04/01/25 - 10/09/26</w:t>
+              <w:t>04/01/25 - 10/29/26</w:t>
             </w:r>
           </w:p>
         </w:tc>
@@ -824,7 +824,7 @@
                 <w:rFonts w:ascii="Calibri" w:hAnsi="Calibri"/>
                 <w:sz w:val="18"/>
               </w:rPr>
-              <w:t>556</w:t>
+              <w:t>576</w:t>
             </w:r>
           </w:p>
         </w:tc>
@@ -913,7 +913,7 @@
                 <w:b/>
                 <w:sz w:val="18"/>
               </w:rPr>
-              <w:t>101</w:t>
+              <w:t>108</w:t>
             </w:r>
           </w:p>
         </w:tc>
@@ -981,7 +981,7 @@
                 <w:rFonts w:ascii="Calibri" w:hAnsi="Calibri"/>
                 <w:sz w:val="18"/>
               </w:rPr>
-              <w:t>294</w:t>
+              <w:t>303</w:t>
             </w:r>
           </w:p>
         </w:tc>
@@ -1077,7 +1077,7 @@
                 <w:color w:val="FF0000"/>
                 <w:sz w:val="18"/>
               </w:rPr>
-              <w:t>337%</w:t>
+              <w:t>360%</w:t>
             </w:r>
           </w:p>
         </w:tc>
@@ -1360,7 +1360,7 @@
                 <w:rFonts w:ascii="Calibri" w:hAnsi="Calibri"/>
                 <w:sz w:val="18"/>
               </w:rPr>
-              <w:t>$284,997</w:t>
+              <w:t>$318,947</w:t>
             </w:r>
           </w:p>
         </w:tc>
@@ -1377,7 +1377,7 @@
                 <w:rFonts w:ascii="Calibri" w:hAnsi="Calibri"/>
                 <w:sz w:val="18"/>
               </w:rPr>
-              <w:t>$464,177</w:t>
+              <w:t>$504,930</w:t>
             </w:r>
           </w:p>
         </w:tc>
@@ -1395,7 +1395,7 @@
                 <w:b/>
                 <w:sz w:val="18"/>
               </w:rPr>
-              <w:t>$178,499</w:t>
+              <w:t>$241,821</w:t>
             </w:r>
           </w:p>
         </w:tc>
@@ -1463,7 +1463,7 @@
                 <w:rFonts w:ascii="Calibri" w:hAnsi="Calibri"/>
                 <w:sz w:val="18"/>
               </w:rPr>
-              <w:t>$1,032,727</w:t>
+              <w:t>$1,170,752</w:t>
             </w:r>
           </w:p>
         </w:tc>
@@ -1520,7 +1520,7 @@
                 <w:rFonts w:ascii="Calibri" w:hAnsi="Calibri"/>
                 <w:sz w:val="18"/>
               </w:rPr>
-              <w:t>83%</w:t>
+              <w:t>93%</w:t>
             </w:r>
           </w:p>
         </w:tc>
@@ -1538,7 +1538,7 @@
                 <w:rFonts w:ascii="Calibri" w:hAnsi="Calibri"/>
                 <w:sz w:val="18"/>
               </w:rPr>
-              <w:t>78%</w:t>
+              <w:t>85%</w:t>
             </w:r>
           </w:p>
         </w:tc>
@@ -1557,7 +1557,7 @@
                 <w:b/>
                 <w:sz w:val="18"/>
               </w:rPr>
-              <w:t>64%</w:t>
+              <w:t>87%</w:t>
             </w:r>
           </w:p>
         </w:tc>
@@ -1629,7 +1629,7 @@
                 <w:rFonts w:ascii="Calibri" w:hAnsi="Calibri"/>
                 <w:sz w:val="18"/>
               </w:rPr>
-              <w:t>45%</w:t>
+              <w:t>51%</w:t>
             </w:r>
           </w:p>
         </w:tc>
@@ -1875,7 +1875,7 @@
                 <w:b/>
                 <w:sz w:val="18"/>
               </w:rPr>
-              <w:t>$468,582</w:t>
+              <w:t>$556,191</w:t>
             </w:r>
           </w:p>
         </w:tc>
@@ -1943,7 +1943,7 @@
                 <w:rFonts w:ascii="Calibri" w:hAnsi="Calibri"/>
                 <w:sz w:val="18"/>
               </w:rPr>
-              <w:t>$1,152,082</w:t>
+              <w:t>$1,239,690</w:t>
             </w:r>
           </w:p>
         </w:tc>
@@ -2038,7 +2038,7 @@
                 <w:color w:val="FF0000"/>
                 <w:sz w:val="18"/>
               </w:rPr>
-              <w:t>215%</w:t>
+              <w:t>255%</w:t>
             </w:r>
           </w:p>
         </w:tc>
@@ -2110,7 +2110,7 @@
                 <w:rFonts w:ascii="Calibri" w:hAnsi="Calibri"/>
                 <w:sz w:val="18"/>
               </w:rPr>
-              <w:t>64%</w:t>
+              <w:t>68%</w:t>
             </w:r>
           </w:p>
         </w:tc>
@@ -2167,7 +2167,7 @@
                 <w:rFonts w:ascii="Calibri" w:hAnsi="Calibri"/>
                 <w:sz w:val="18"/>
               </w:rPr>
-              <w:t>19%</w:t>
+              <w:t>33%</w:t>
             </w:r>
           </w:p>
         </w:tc>
@@ -2185,7 +2185,7 @@
                 <w:rFonts w:ascii="Calibri" w:hAnsi="Calibri"/>
                 <w:sz w:val="18"/>
               </w:rPr>
-              <w:t>9%</w:t>
+              <w:t>18%</w:t>
             </w:r>
           </w:p>
         </w:tc>
@@ -2205,7 +2205,7 @@
                 <w:color w:val="FF0000"/>
                 <w:sz w:val="18"/>
               </w:rPr>
-              <w:t>-62%</w:t>
+              <w:t>-57%</w:t>
             </w:r>
           </w:p>
         </w:tc>
@@ -2278,7 +2278,7 @@
                 <w:color w:val="FF0000"/>
                 <w:sz w:val="18"/>
               </w:rPr>
-              <w:t>-10%</w:t>
+              <w:t>-6%</w:t>
             </w:r>
           </w:p>
         </w:tc>
@@ -2524,24 +2524,7 @@
                 <w:b/>
                 <w:sz w:val="18"/>
               </w:rPr>
-              <w:t>316</w:t>
-            </w:r>
-          </w:p>
-        </w:tc>
-        <w:tc>
-          <w:tcPr>
-            <w:tcW w:type="dxa" w:w="960"/>
-          </w:tcPr>
-          <w:p>
-            <w:pPr>
-              <w:jc w:val="center"/>
-            </w:pPr>
-            <w:r>
-              <w:rPr>
-                <w:rFonts w:ascii="Calibri" w:hAnsi="Calibri"/>
-                <w:sz w:val="18"/>
-              </w:rPr>
-              <w:t>18</w:t>
+              <w:t>380</w:t>
             </w:r>
           </w:p>
         </w:tc>
@@ -2592,7 +2575,24 @@
                 <w:rFonts w:ascii="Calibri" w:hAnsi="Calibri"/>
                 <w:sz w:val="18"/>
               </w:rPr>
-              <w:t>511</w:t>
+              <w:t>0</w:t>
+            </w:r>
+          </w:p>
+        </w:tc>
+        <w:tc>
+          <w:tcPr>
+            <w:tcW w:type="dxa" w:w="960"/>
+          </w:tcPr>
+          <w:p>
+            <w:pPr>
+              <w:jc w:val="center"/>
+            </w:pPr>
+            <w:r>
+              <w:rPr>
+                <w:rFonts w:ascii="Calibri" w:hAnsi="Calibri"/>
+                <w:sz w:val="18"/>
+              </w:rPr>
+              <w:t>557</w:t>
             </w:r>
           </w:p>
         </w:tc>
@@ -2688,7 +2688,7 @@
                 <w:color w:val="FF0000"/>
                 <w:sz w:val="18"/>
               </w:rPr>
-              <w:t>162%</w:t>
+              <w:t>195%</w:t>
             </w:r>
           </w:p>
         </w:tc>
@@ -2760,7 +2760,7 @@
                 <w:rFonts w:ascii="Calibri" w:hAnsi="Calibri"/>
                 <w:sz w:val="18"/>
               </w:rPr>
-              <w:t>44%</w:t>
+              <w:t>48%</w:t>
             </w:r>
           </w:p>
         </w:tc>
@@ -2820,7 +2820,7 @@
         <w:t>behind schedule</w:t>
       </w:r>
       <w:r>
-        <w:t xml:space="preserve"> (120% of planned duration). Partial income received (83%). Cost within budget (67% of planned). Profitable (19% margin). Labor efficient (70% of planned).</w:t>
+        <w:t xml:space="preserve"> (120% of planned duration). Partial income received (93%). Cost within budget (67% of planned). Profitable (33% margin). Labor efficient (70% of planned).</w:t>
       </w:r>
     </w:p>
     <w:p>
@@ -2837,7 +2837,7 @@
         <w:t xml:space="preserve">Drilling and Well Installation: </w:t>
       </w:r>
       <w:r>
-        <w:t xml:space="preserve">Completed on schedule (89% of planned duration). Partial income received (78%). Cost within budget (86% of planned). Profitable (9% margin). Labor </w:t>
+        <w:t xml:space="preserve">Completed on schedule (89% of planned duration). Partial income received (85%). Cost within budget (86% of planned). Profitable (18% margin). Labor </w:t>
       </w:r>
       <w:r>
         <w:rPr>
@@ -2871,7 +2871,7 @@
         <w:t xml:space="preserve">Construction and Installation: </w:t>
       </w:r>
       <w:r>
-        <w:t xml:space="preserve">Currently active with ongoing operations. Currently burning 215% of the budget and 162% of the planned labor while the duration is at 337% expected. </w:t>
+        <w:t xml:space="preserve">Currently active with ongoing operations. Currently burning 255% of the budget and 195% of the planned labor while the duration is at 360% expected. </w:t>
       </w:r>
       <w:r>
         <w:rPr>
@@ -2905,7 +2905,7 @@
         <w:t xml:space="preserve">Operation and Maintenance: </w:t>
       </w:r>
       <w:r>
-        <w:t>Actual: 01/27/26 - 08/14/26 | Baseline: 10/14/2025 - 05/01/2026</w:t>
+        <w:t>Actual: 02/16/26 - 09/03/26 | Baseline: 10/14/2025 - 05/01/2026</w:t>
       </w:r>
     </w:p>
     <w:p>
@@ -2922,7 +2922,7 @@
         <w:t xml:space="preserve">Demobilization: </w:t>
       </w:r>
       <w:r>
-        <w:t>Actual: 08/17/26 - 09/07/26 | Baseline: 05/04/2026 - 05/25/2026</w:t>
+        <w:t>Actual: 09/04/26 - 09/25/26 | Baseline: 05/04/2026 - 05/25/2026</w:t>
       </w:r>
     </w:p>
     <w:p>
@@ -2939,7 +2939,7 @@
         <w:t xml:space="preserve">Reporting: </w:t>
       </w:r>
       <w:r>
-        <w:t>Actual: 08/17/26 - 10/09/26 | Baseline: 05/04/2026 - 06/26/2026</w:t>
+        <w:t>Actual: 09/04/26 - 10/29/26 | Baseline: 05/04/2026 - 06/26/2026</w:t>
       </w:r>
     </w:p>
     <w:p>

</xml_diff>

<commit_message>
Update web reports - 2026-03-19 21:49:36
</commit_message>
<xml_diff>
--- a/Ohio Hospital Project Cost Tracking Report.docx
+++ b/Ohio Hospital Project Cost Tracking Report.docx
@@ -16,7 +16,7 @@
         <w:jc w:val="center"/>
       </w:pPr>
       <w:r>
-        <w:t>Report Date: January 29, 2026</w:t>
+        <w:t>Report Date: March 19, 2026</w:t>
       </w:r>
     </w:p>
     <w:p>
@@ -126,7 +126,6 @@
             <w:r>
               <w:rPr>
                 <w:rFonts w:ascii="Calibri" w:hAnsi="Calibri"/>
-                <w:b/>
                 <w:sz w:val="18"/>
               </w:rPr>
               <w:t>400</w:t>
@@ -144,6 +143,7 @@
             <w:r>
               <w:rPr>
                 <w:rFonts w:ascii="Calibri" w:hAnsi="Calibri"/>
+                <w:b/>
                 <w:sz w:val="18"/>
               </w:rPr>
               <w:t>500</w:t>
@@ -282,7 +282,6 @@
             <w:r>
               <w:rPr>
                 <w:rFonts w:ascii="Calibri" w:hAnsi="Calibri"/>
-                <w:b/>
                 <w:sz w:val="18"/>
               </w:rPr>
               <w:t>Construction</w:t>
@@ -300,6 +299,7 @@
             <w:r>
               <w:rPr>
                 <w:rFonts w:ascii="Calibri" w:hAnsi="Calibri"/>
+                <w:b/>
                 <w:sz w:val="18"/>
               </w:rPr>
               <w:t>Heating</w:t>
@@ -439,10 +439,9 @@
             <w:r>
               <w:rPr>
                 <w:rFonts w:ascii="Calibri" w:hAnsi="Calibri"/>
-                <w:b/>
                 <w:sz w:val="18"/>
               </w:rPr>
-              <w:t>In Progress</w:t>
+              <w:t>Completed</w:t>
             </w:r>
           </w:p>
         </w:tc>
@@ -457,9 +456,10 @@
             <w:r>
               <w:rPr>
                 <w:rFonts w:ascii="Calibri" w:hAnsi="Calibri"/>
+                <w:b/>
                 <w:sz w:val="18"/>
               </w:rPr>
-              <w:t>Future</w:t>
+              <w:t>In Progress</w:t>
             </w:r>
           </w:p>
         </w:tc>
@@ -596,10 +596,27 @@
             <w:r>
               <w:rPr>
                 <w:rFonts w:ascii="Calibri" w:hAnsi="Calibri"/>
+                <w:sz w:val="18"/>
+              </w:rPr>
+              <w:t>09/02/25 - 01/28/26</w:t>
+            </w:r>
+          </w:p>
+        </w:tc>
+        <w:tc>
+          <w:tcPr>
+            <w:tcW w:type="dxa" w:w="960"/>
+          </w:tcPr>
+          <w:p>
+            <w:pPr>
+              <w:jc w:val="center"/>
+            </w:pPr>
+            <w:r>
+              <w:rPr>
+                <w:rFonts w:ascii="Calibri" w:hAnsi="Calibri"/>
                 <w:b/>
                 <w:sz w:val="18"/>
               </w:rPr>
-              <w:t>09/02/25 - 02/13/26</w:t>
+              <w:t>01/29/26 - 08/16/26</w:t>
             </w:r>
           </w:p>
         </w:tc>
@@ -616,7 +633,7 @@
                 <w:rFonts w:ascii="Calibri" w:hAnsi="Calibri"/>
                 <w:sz w:val="18"/>
               </w:rPr>
-              <w:t>02/16/26 - 09/03/26</w:t>
+              <w:t>08/18/26 - 09/08/26</w:t>
             </w:r>
           </w:p>
         </w:tc>
@@ -633,7 +650,7 @@
                 <w:rFonts w:ascii="Calibri" w:hAnsi="Calibri"/>
                 <w:sz w:val="18"/>
               </w:rPr>
-              <w:t>09/04/26 - 09/25/26</w:t>
+              <w:t>08/18/26 - 10/12/26</w:t>
             </w:r>
           </w:p>
         </w:tc>
@@ -650,24 +667,7 @@
                 <w:rFonts w:ascii="Calibri" w:hAnsi="Calibri"/>
                 <w:sz w:val="18"/>
               </w:rPr>
-              <w:t>09/04/26 - 10/29/26</w:t>
-            </w:r>
-          </w:p>
-        </w:tc>
-        <w:tc>
-          <w:tcPr>
-            <w:tcW w:type="dxa" w:w="960"/>
-          </w:tcPr>
-          <w:p>
-            <w:pPr>
-              <w:jc w:val="center"/>
-            </w:pPr>
-            <w:r>
-              <w:rPr>
-                <w:rFonts w:ascii="Calibri" w:hAnsi="Calibri"/>
-                <w:sz w:val="18"/>
-              </w:rPr>
-              <w:t>04/01/25 - 10/29/26</w:t>
+              <w:t>04/01/25 - 10/12/26</w:t>
             </w:r>
           </w:p>
         </w:tc>
@@ -753,7 +753,6 @@
             <w:r>
               <w:rPr>
                 <w:rFonts w:ascii="Calibri" w:hAnsi="Calibri"/>
-                <w:b/>
                 <w:sz w:val="18"/>
               </w:rPr>
               <w:t>30</w:t>
@@ -771,6 +770,7 @@
             <w:r>
               <w:rPr>
                 <w:rFonts w:ascii="Calibri" w:hAnsi="Calibri"/>
+                <w:b/>
                 <w:sz w:val="18"/>
               </w:rPr>
               <w:t>200</w:t>
@@ -824,7 +824,7 @@
                 <w:rFonts w:ascii="Calibri" w:hAnsi="Calibri"/>
                 <w:sz w:val="18"/>
               </w:rPr>
-              <w:t>576</w:t>
+              <w:t>559</w:t>
             </w:r>
           </w:p>
         </w:tc>
@@ -910,10 +910,27 @@
             <w:r>
               <w:rPr>
                 <w:rFonts w:ascii="Calibri" w:hAnsi="Calibri"/>
+                <w:sz w:val="18"/>
+              </w:rPr>
+              <w:t>107</w:t>
+            </w:r>
+          </w:p>
+        </w:tc>
+        <w:tc>
+          <w:tcPr>
+            <w:tcW w:type="dxa" w:w="960"/>
+          </w:tcPr>
+          <w:p>
+            <w:pPr>
+              <w:jc w:val="center"/>
+            </w:pPr>
+            <w:r>
+              <w:rPr>
+                <w:rFonts w:ascii="Calibri" w:hAnsi="Calibri"/>
                 <w:b/>
                 <w:sz w:val="18"/>
               </w:rPr>
-              <w:t>108</w:t>
+              <w:t>49</w:t>
             </w:r>
           </w:p>
         </w:tc>
@@ -964,24 +981,7 @@
                 <w:rFonts w:ascii="Calibri" w:hAnsi="Calibri"/>
                 <w:sz w:val="18"/>
               </w:rPr>
-              <w:t>N/A</w:t>
-            </w:r>
-          </w:p>
-        </w:tc>
-        <w:tc>
-          <w:tcPr>
-            <w:tcW w:type="dxa" w:w="960"/>
-          </w:tcPr>
-          <w:p>
-            <w:pPr>
-              <w:jc w:val="center"/>
-            </w:pPr>
-            <w:r>
-              <w:rPr>
-                <w:rFonts w:ascii="Calibri" w:hAnsi="Calibri"/>
-                <w:sz w:val="18"/>
-              </w:rPr>
-              <w:t>303</w:t>
+              <w:t>352</w:t>
             </w:r>
           </w:p>
         </w:tc>
@@ -1073,11 +1073,29 @@
             <w:r>
               <w:rPr>
                 <w:rFonts w:ascii="Calibri" w:hAnsi="Calibri"/>
-                <w:b/>
                 <w:color w:val="FF0000"/>
                 <w:sz w:val="18"/>
               </w:rPr>
-              <w:t>360%</w:t>
+              <w:t>357%</w:t>
+            </w:r>
+          </w:p>
+        </w:tc>
+        <w:tc>
+          <w:tcPr>
+            <w:tcW w:type="dxa" w:w="960"/>
+            <w:shd w:val="clear" w:color="auto" w:fill="D4F0D4"/>
+          </w:tcPr>
+          <w:p>
+            <w:pPr>
+              <w:jc w:val="center"/>
+            </w:pPr>
+            <w:r>
+              <w:rPr>
+                <w:rFonts w:ascii="Calibri" w:hAnsi="Calibri"/>
+                <w:b/>
+                <w:sz w:val="18"/>
+              </w:rPr>
+              <w:t>24%</w:t>
             </w:r>
           </w:p>
         </w:tc>
@@ -1131,25 +1149,7 @@
                 <w:rFonts w:ascii="Calibri" w:hAnsi="Calibri"/>
                 <w:sz w:val="18"/>
               </w:rPr>
-              <w:t>N/A</w:t>
-            </w:r>
-          </w:p>
-        </w:tc>
-        <w:tc>
-          <w:tcPr>
-            <w:tcW w:type="dxa" w:w="960"/>
-            <w:shd w:val="clear" w:color="auto" w:fill="D4F0D4"/>
-          </w:tcPr>
-          <w:p>
-            <w:pPr>
-              <w:jc w:val="center"/>
-            </w:pPr>
-            <w:r>
-              <w:rPr>
-                <w:rFonts w:ascii="Calibri" w:hAnsi="Calibri"/>
-                <w:sz w:val="18"/>
-              </w:rPr>
-              <w:t>53%</w:t>
+              <w:t>63%</w:t>
             </w:r>
           </w:p>
         </w:tc>
@@ -1235,7 +1235,6 @@
             <w:r>
               <w:rPr>
                 <w:rFonts w:ascii="Calibri" w:hAnsi="Calibri"/>
-                <w:b/>
                 <w:sz w:val="18"/>
               </w:rPr>
               <w:t>$279,193</w:t>
@@ -1253,6 +1252,7 @@
             <w:r>
               <w:rPr>
                 <w:rFonts w:ascii="Calibri" w:hAnsi="Calibri"/>
+                <w:b/>
                 <w:sz w:val="18"/>
               </w:rPr>
               <w:t>$648,306</w:t>
@@ -1360,7 +1360,7 @@
                 <w:rFonts w:ascii="Calibri" w:hAnsi="Calibri"/>
                 <w:sz w:val="18"/>
               </w:rPr>
-              <w:t>$318,947</w:t>
+              <w:t>$352,897</w:t>
             </w:r>
           </w:p>
         </w:tc>
@@ -1392,10 +1392,27 @@
             <w:r>
               <w:rPr>
                 <w:rFonts w:ascii="Calibri" w:hAnsi="Calibri"/>
+                <w:sz w:val="18"/>
+              </w:rPr>
+              <w:t>$246,717</w:t>
+            </w:r>
+          </w:p>
+        </w:tc>
+        <w:tc>
+          <w:tcPr>
+            <w:tcW w:type="dxa" w:w="960"/>
+          </w:tcPr>
+          <w:p>
+            <w:pPr>
+              <w:jc w:val="center"/>
+            </w:pPr>
+            <w:r>
+              <w:rPr>
+                <w:rFonts w:ascii="Calibri" w:hAnsi="Calibri"/>
                 <w:b/>
                 <w:sz w:val="18"/>
               </w:rPr>
-              <w:t>$241,821</w:t>
+              <w:t>$92,439</w:t>
             </w:r>
           </w:p>
         </w:tc>
@@ -1446,24 +1463,7 @@
                 <w:rFonts w:ascii="Calibri" w:hAnsi="Calibri"/>
                 <w:sz w:val="18"/>
               </w:rPr>
-              <w:t>$0</w:t>
-            </w:r>
-          </w:p>
-        </w:tc>
-        <w:tc>
-          <w:tcPr>
-            <w:tcW w:type="dxa" w:w="960"/>
-          </w:tcPr>
-          <w:p>
-            <w:pPr>
-              <w:jc w:val="center"/>
-            </w:pPr>
-            <w:r>
-              <w:rPr>
-                <w:rFonts w:ascii="Calibri" w:hAnsi="Calibri"/>
-                <w:sz w:val="18"/>
-              </w:rPr>
-              <w:t>$1,170,752</w:t>
+              <w:t>$1,302,036</w:t>
             </w:r>
           </w:p>
         </w:tc>
@@ -1520,7 +1520,7 @@
                 <w:rFonts w:ascii="Calibri" w:hAnsi="Calibri"/>
                 <w:sz w:val="18"/>
               </w:rPr>
-              <w:t>93%</w:t>
+              <w:t>103%</w:t>
             </w:r>
           </w:p>
         </w:tc>
@@ -1554,10 +1554,28 @@
             <w:r>
               <w:rPr>
                 <w:rFonts w:ascii="Calibri" w:hAnsi="Calibri"/>
+                <w:sz w:val="18"/>
+              </w:rPr>
+              <w:t>88%</w:t>
+            </w:r>
+          </w:p>
+        </w:tc>
+        <w:tc>
+          <w:tcPr>
+            <w:tcW w:type="dxa" w:w="960"/>
+            <w:shd w:val="clear" w:color="auto" w:fill="D4F0D4"/>
+          </w:tcPr>
+          <w:p>
+            <w:pPr>
+              <w:jc w:val="center"/>
+            </w:pPr>
+            <w:r>
+              <w:rPr>
+                <w:rFonts w:ascii="Calibri" w:hAnsi="Calibri"/>
                 <w:b/>
                 <w:sz w:val="18"/>
               </w:rPr>
-              <w:t>87%</w:t>
+              <w:t>14%</w:t>
             </w:r>
           </w:p>
         </w:tc>
@@ -1611,25 +1629,7 @@
                 <w:rFonts w:ascii="Calibri" w:hAnsi="Calibri"/>
                 <w:sz w:val="18"/>
               </w:rPr>
-              <w:t>N/A</w:t>
-            </w:r>
-          </w:p>
-        </w:tc>
-        <w:tc>
-          <w:tcPr>
-            <w:tcW w:type="dxa" w:w="960"/>
-            <w:shd w:val="clear" w:color="auto" w:fill="D4F0D4"/>
-          </w:tcPr>
-          <w:p>
-            <w:pPr>
-              <w:jc w:val="center"/>
-            </w:pPr>
-            <w:r>
-              <w:rPr>
-                <w:rFonts w:ascii="Calibri" w:hAnsi="Calibri"/>
-                <w:sz w:val="18"/>
-              </w:rPr>
-              <w:t>51%</w:t>
+              <w:t>57%</w:t>
             </w:r>
           </w:p>
         </w:tc>
@@ -1715,7 +1715,6 @@
             <w:r>
               <w:rPr>
                 <w:rFonts w:ascii="Calibri" w:hAnsi="Calibri"/>
-                <w:b/>
                 <w:sz w:val="18"/>
               </w:rPr>
               <w:t>$218,009</w:t>
@@ -1733,6 +1732,7 @@
             <w:r>
               <w:rPr>
                 <w:rFonts w:ascii="Calibri" w:hAnsi="Calibri"/>
+                <w:b/>
                 <w:sz w:val="18"/>
               </w:rPr>
               <w:t>$437,461</w:t>
@@ -1872,10 +1872,27 @@
             <w:r>
               <w:rPr>
                 <w:rFonts w:ascii="Calibri" w:hAnsi="Calibri"/>
+                <w:sz w:val="18"/>
+              </w:rPr>
+              <w:t>$593,133</w:t>
+            </w:r>
+          </w:p>
+        </w:tc>
+        <w:tc>
+          <w:tcPr>
+            <w:tcW w:type="dxa" w:w="960"/>
+          </w:tcPr>
+          <w:p>
+            <w:pPr>
+              <w:jc w:val="center"/>
+            </w:pPr>
+            <w:r>
+              <w:rPr>
+                <w:rFonts w:ascii="Calibri" w:hAnsi="Calibri"/>
                 <w:b/>
                 <w:sz w:val="18"/>
               </w:rPr>
-              <w:t>$556,191</w:t>
+              <w:t>$79,612</w:t>
             </w:r>
           </w:p>
         </w:tc>
@@ -1926,24 +1943,7 @@
                 <w:rFonts w:ascii="Calibri" w:hAnsi="Calibri"/>
                 <w:sz w:val="18"/>
               </w:rPr>
-              <w:t>$0</w:t>
-            </w:r>
-          </w:p>
-        </w:tc>
-        <w:tc>
-          <w:tcPr>
-            <w:tcW w:type="dxa" w:w="960"/>
-          </w:tcPr>
-          <w:p>
-            <w:pPr>
-              <w:jc w:val="center"/>
-            </w:pPr>
-            <w:r>
-              <w:rPr>
-                <w:rFonts w:ascii="Calibri" w:hAnsi="Calibri"/>
-                <w:sz w:val="18"/>
-              </w:rPr>
-              <w:t>$1,239,690</w:t>
+              <w:t>$1,356,245</w:t>
             </w:r>
           </w:p>
         </w:tc>
@@ -2034,11 +2034,29 @@
             <w:r>
               <w:rPr>
                 <w:rFonts w:ascii="Calibri" w:hAnsi="Calibri"/>
-                <w:b/>
                 <w:color w:val="FF0000"/>
                 <w:sz w:val="18"/>
               </w:rPr>
-              <w:t>255%</w:t>
+              <w:t>272%</w:t>
+            </w:r>
+          </w:p>
+        </w:tc>
+        <w:tc>
+          <w:tcPr>
+            <w:tcW w:type="dxa" w:w="960"/>
+            <w:shd w:val="clear" w:color="auto" w:fill="D4F0D4"/>
+          </w:tcPr>
+          <w:p>
+            <w:pPr>
+              <w:jc w:val="center"/>
+            </w:pPr>
+            <w:r>
+              <w:rPr>
+                <w:rFonts w:ascii="Calibri" w:hAnsi="Calibri"/>
+                <w:b/>
+                <w:sz w:val="18"/>
+              </w:rPr>
+              <w:t>18%</w:t>
             </w:r>
           </w:p>
         </w:tc>
@@ -2092,25 +2110,7 @@
                 <w:rFonts w:ascii="Calibri" w:hAnsi="Calibri"/>
                 <w:sz w:val="18"/>
               </w:rPr>
-              <w:t>N/A</w:t>
-            </w:r>
-          </w:p>
-        </w:tc>
-        <w:tc>
-          <w:tcPr>
-            <w:tcW w:type="dxa" w:w="960"/>
-            <w:shd w:val="clear" w:color="auto" w:fill="D4F0D4"/>
-          </w:tcPr>
-          <w:p>
-            <w:pPr>
-              <w:jc w:val="center"/>
-            </w:pPr>
-            <w:r>
-              <w:rPr>
-                <w:rFonts w:ascii="Calibri" w:hAnsi="Calibri"/>
-                <w:sz w:val="18"/>
-              </w:rPr>
-              <w:t>68%</w:t>
+              <w:t>75%</w:t>
             </w:r>
           </w:p>
         </w:tc>
@@ -2167,7 +2167,7 @@
                 <w:rFonts w:ascii="Calibri" w:hAnsi="Calibri"/>
                 <w:sz w:val="18"/>
               </w:rPr>
-              <w:t>33%</w:t>
+              <w:t>47%</w:t>
             </w:r>
           </w:p>
         </w:tc>
@@ -2201,11 +2201,10 @@
             <w:r>
               <w:rPr>
                 <w:rFonts w:ascii="Calibri" w:hAnsi="Calibri"/>
-                <w:b/>
                 <w:color w:val="FF0000"/>
                 <w:sz w:val="18"/>
               </w:rPr>
-              <w:t>-57%</w:t>
+              <w:t>-58%</w:t>
             </w:r>
           </w:p>
         </w:tc>
@@ -2221,9 +2220,10 @@
             <w:r>
               <w:rPr>
                 <w:rFonts w:ascii="Calibri" w:hAnsi="Calibri"/>
+                <w:b/>
                 <w:sz w:val="18"/>
               </w:rPr>
-              <w:t>N/A</w:t>
+              <w:t>16%</w:t>
             </w:r>
           </w:p>
         </w:tc>
@@ -2278,7 +2278,7 @@
                 <w:color w:val="FF0000"/>
                 <w:sz w:val="18"/>
               </w:rPr>
-              <w:t>-6%</w:t>
+              <w:t>-4%</w:t>
             </w:r>
           </w:p>
         </w:tc>
@@ -2364,7 +2364,6 @@
             <w:r>
               <w:rPr>
                 <w:rFonts w:ascii="Calibri" w:hAnsi="Calibri"/>
-                <w:b/>
                 <w:sz w:val="18"/>
               </w:rPr>
               <w:t>195</w:t>
@@ -2382,6 +2381,7 @@
             <w:r>
               <w:rPr>
                 <w:rFonts w:ascii="Calibri" w:hAnsi="Calibri"/>
+                <w:b/>
                 <w:sz w:val="18"/>
               </w:rPr>
               <w:t>537</w:t>
@@ -2521,10 +2521,27 @@
             <w:r>
               <w:rPr>
                 <w:rFonts w:ascii="Calibri" w:hAnsi="Calibri"/>
+                <w:sz w:val="18"/>
+              </w:rPr>
+              <w:t>316</w:t>
+            </w:r>
+          </w:p>
+        </w:tc>
+        <w:tc>
+          <w:tcPr>
+            <w:tcW w:type="dxa" w:w="960"/>
+          </w:tcPr>
+          <w:p>
+            <w:pPr>
+              <w:jc w:val="center"/>
+            </w:pPr>
+            <w:r>
+              <w:rPr>
+                <w:rFonts w:ascii="Calibri" w:hAnsi="Calibri"/>
                 <w:b/>
                 <w:sz w:val="18"/>
               </w:rPr>
-              <w:t>380</w:t>
+              <w:t>135</w:t>
             </w:r>
           </w:p>
         </w:tc>
@@ -2575,24 +2592,7 @@
                 <w:rFonts w:ascii="Calibri" w:hAnsi="Calibri"/>
                 <w:sz w:val="18"/>
               </w:rPr>
-              <w:t>0</w:t>
-            </w:r>
-          </w:p>
-        </w:tc>
-        <w:tc>
-          <w:tcPr>
-            <w:tcW w:type="dxa" w:w="960"/>
-          </w:tcPr>
-          <w:p>
-            <w:pPr>
-              <w:jc w:val="center"/>
-            </w:pPr>
-            <w:r>
-              <w:rPr>
-                <w:rFonts w:ascii="Calibri" w:hAnsi="Calibri"/>
-                <w:sz w:val="18"/>
-              </w:rPr>
-              <w:t>557</w:t>
+              <w:t>628</w:t>
             </w:r>
           </w:p>
         </w:tc>
@@ -2684,11 +2684,29 @@
             <w:r>
               <w:rPr>
                 <w:rFonts w:ascii="Calibri" w:hAnsi="Calibri"/>
-                <w:b/>
                 <w:color w:val="FF0000"/>
                 <w:sz w:val="18"/>
               </w:rPr>
-              <w:t>195%</w:t>
+              <w:t>162%</w:t>
+            </w:r>
+          </w:p>
+        </w:tc>
+        <w:tc>
+          <w:tcPr>
+            <w:tcW w:type="dxa" w:w="960"/>
+            <w:shd w:val="clear" w:color="auto" w:fill="D4F0D4"/>
+          </w:tcPr>
+          <w:p>
+            <w:pPr>
+              <w:jc w:val="center"/>
+            </w:pPr>
+            <w:r>
+              <w:rPr>
+                <w:rFonts w:ascii="Calibri" w:hAnsi="Calibri"/>
+                <w:b/>
+                <w:sz w:val="18"/>
+              </w:rPr>
+              <w:t>25%</w:t>
             </w:r>
           </w:p>
         </w:tc>
@@ -2742,25 +2760,7 @@
                 <w:rFonts w:ascii="Calibri" w:hAnsi="Calibri"/>
                 <w:sz w:val="18"/>
               </w:rPr>
-              <w:t>N/A</w:t>
-            </w:r>
-          </w:p>
-        </w:tc>
-        <w:tc>
-          <w:tcPr>
-            <w:tcW w:type="dxa" w:w="960"/>
-            <w:shd w:val="clear" w:color="auto" w:fill="D4F0D4"/>
-          </w:tcPr>
-          <w:p>
-            <w:pPr>
-              <w:jc w:val="center"/>
-            </w:pPr>
-            <w:r>
-              <w:rPr>
-                <w:rFonts w:ascii="Calibri" w:hAnsi="Calibri"/>
-                <w:sz w:val="18"/>
-              </w:rPr>
-              <w:t>48%</w:t>
+              <w:t>54%</w:t>
             </w:r>
           </w:p>
         </w:tc>
@@ -2820,7 +2820,7 @@
         <w:t>behind schedule</w:t>
       </w:r>
       <w:r>
-        <w:t xml:space="preserve"> (120% of planned duration). Partial income received (93%). Cost within budget (67% of planned). Profitable (33% margin). Labor efficient (70% of planned).</w:t>
+        <w:t xml:space="preserve"> (120% of planned duration). Full income received (103%). Cost within budget (67% of planned). Profitable (47% margin). Labor efficient (70% of planned).</w:t>
       </w:r>
     </w:p>
     <w:p>
@@ -2850,6 +2850,59 @@
       </w:r>
     </w:p>
     <w:p>
+      <w:pPr>
+        <w:ind w:left="360"/>
+      </w:pPr>
+      <w:r>
+        <w:t xml:space="preserve">• </w:t>
+      </w:r>
+      <w:r>
+        <w:rPr>
+          <w:b/>
+        </w:rPr>
+        <w:t xml:space="preserve">Construction and Installation: </w:t>
+      </w:r>
+      <w:r>
+        <w:t xml:space="preserve">Completed </w:t>
+      </w:r>
+      <w:r>
+        <w:rPr>
+          <w:color w:val="FF0000"/>
+        </w:rPr>
+        <w:t>behind schedule</w:t>
+      </w:r>
+      <w:r>
+        <w:t xml:space="preserve"> (357% of planned duration). Partial income received (88%). Cost </w:t>
+      </w:r>
+      <w:r>
+        <w:rPr>
+          <w:color w:val="FF0000"/>
+        </w:rPr>
+        <w:t>over budget</w:t>
+      </w:r>
+      <w:r>
+        <w:t xml:space="preserve"> (272% of planned). </w:t>
+      </w:r>
+      <w:r>
+        <w:rPr>
+          <w:color w:val="FF0000"/>
+        </w:rPr>
+        <w:t>Loss (</w:t>
+      </w:r>
+      <w:r>
+        <w:t xml:space="preserve">-58% margin). Note: This negative margin may be due to the lagging of receiving invoices, which are usually sent at the end of task or end of month. </w:t>
+      </w:r>
+      <w:r>
+        <w:rPr>
+          <w:color w:val="FF0000"/>
+        </w:rPr>
+        <w:t>Labor over budget</w:t>
+      </w:r>
+      <w:r>
+        <w:t xml:space="preserve"> (162% of planned).</w:t>
+      </w:r>
+    </w:p>
+    <w:p>
       <w:r>
         <w:rPr>
           <w:b/>
@@ -2868,19 +2921,10 @@
         <w:rPr>
           <w:b/>
         </w:rPr>
-        <w:t xml:space="preserve">Construction and Installation: </w:t>
+        <w:t xml:space="preserve">Operation and Maintenance: </w:t>
       </w:r>
       <w:r>
-        <w:t xml:space="preserve">Currently active with ongoing operations. Currently burning 255% of the budget and 195% of the planned labor while the duration is at 360% expected. </w:t>
-      </w:r>
-      <w:r>
-        <w:rPr>
-          <w:color w:val="FF0000"/>
-        </w:rPr>
-        <w:t>A delay is expected</w:t>
-      </w:r>
-      <w:r>
-        <w:t>.</w:t>
+        <w:t>Currently active with ongoing operations. Currently burning 18% of the budget and 25% of the planned labor while the duration is at 24% expected. Progress tracking shows steady advancement toward completion targets.</w:t>
       </w:r>
     </w:p>
     <w:p>
@@ -2902,27 +2946,10 @@
         <w:rPr>
           <w:b/>
         </w:rPr>
-        <w:t xml:space="preserve">Operation and Maintenance: </w:t>
-      </w:r>
-      <w:r>
-        <w:t>Actual: 02/16/26 - 09/03/26 | Baseline: 10/14/2025 - 05/01/2026</w:t>
-      </w:r>
-    </w:p>
-    <w:p>
-      <w:pPr>
-        <w:ind w:left="360"/>
-      </w:pPr>
-      <w:r>
-        <w:t xml:space="preserve">• </w:t>
-      </w:r>
-      <w:r>
-        <w:rPr>
-          <w:b/>
-        </w:rPr>
         <w:t xml:space="preserve">Demobilization: </w:t>
       </w:r>
       <w:r>
-        <w:t>Actual: 09/04/26 - 09/25/26 | Baseline: 05/04/2026 - 05/25/2026</w:t>
+        <w:t>Actual: 08/18/26 - 09/08/26 | Baseline: 05/04/2026 - 05/25/2026</w:t>
       </w:r>
     </w:p>
     <w:p>
@@ -2939,7 +2966,7 @@
         <w:t xml:space="preserve">Reporting: </w:t>
       </w:r>
       <w:r>
-        <w:t>Actual: 09/04/26 - 10/29/26 | Baseline: 05/04/2026 - 06/26/2026</w:t>
+        <w:t>Actual: 08/18/26 - 10/12/26 | Baseline: 05/04/2026 - 06/26/2026</w:t>
       </w:r>
     </w:p>
     <w:p>
@@ -3014,7 +3041,7 @@
       <w:r>
         <w:drawing>
           <wp:inline xmlns:a="http://schemas.openxmlformats.org/drawingml/2006/main" xmlns:pic="http://schemas.openxmlformats.org/drawingml/2006/picture">
-            <wp:extent cx="5943600" cy="3961289"/>
+            <wp:extent cx="5943600" cy="3964625"/>
             <wp:docPr id="1" name="Picture 1"/>
             <wp:cNvGraphicFramePr>
               <a:graphicFrameLocks noChangeAspect="1"/>
@@ -3035,7 +3062,7 @@
                   <pic:spPr>
                     <a:xfrm>
                       <a:off x="0" y="0"/>
-                      <a:ext cx="5943600" cy="3961289"/>
+                      <a:ext cx="5943600" cy="3964625"/>
                     </a:xfrm>
                     <a:prstGeom prst="rect"/>
                   </pic:spPr>
@@ -3117,7 +3144,7 @@
       <w:r>
         <w:drawing>
           <wp:inline xmlns:a="http://schemas.openxmlformats.org/drawingml/2006/main" xmlns:pic="http://schemas.openxmlformats.org/drawingml/2006/picture">
-            <wp:extent cx="5943600" cy="3536091"/>
+            <wp:extent cx="5943600" cy="3544459"/>
             <wp:docPr id="2" name="Picture 2"/>
             <wp:cNvGraphicFramePr>
               <a:graphicFrameLocks noChangeAspect="1"/>
@@ -3138,7 +3165,7 @@
                   <pic:spPr>
                     <a:xfrm>
                       <a:off x="0" y="0"/>
-                      <a:ext cx="5943600" cy="3536091"/>
+                      <a:ext cx="5943600" cy="3544459"/>
                     </a:xfrm>
                     <a:prstGeom prst="rect"/>
                   </pic:spPr>
@@ -3191,7 +3218,7 @@
       <w:r>
         <w:drawing>
           <wp:inline xmlns:a="http://schemas.openxmlformats.org/drawingml/2006/main" xmlns:pic="http://schemas.openxmlformats.org/drawingml/2006/picture">
-            <wp:extent cx="5943600" cy="3536091"/>
+            <wp:extent cx="5943600" cy="3544459"/>
             <wp:docPr id="3" name="Picture 3"/>
             <wp:cNvGraphicFramePr>
               <a:graphicFrameLocks noChangeAspect="1"/>
@@ -3212,7 +3239,7 @@
                   <pic:spPr>
                     <a:xfrm>
                       <a:off x="0" y="0"/>
-                      <a:ext cx="5943600" cy="3536091"/>
+                      <a:ext cx="5943600" cy="3544459"/>
                     </a:xfrm>
                     <a:prstGeom prst="rect"/>
                   </pic:spPr>
@@ -3265,7 +3292,7 @@
       <w:r>
         <w:drawing>
           <wp:inline xmlns:a="http://schemas.openxmlformats.org/drawingml/2006/main" xmlns:pic="http://schemas.openxmlformats.org/drawingml/2006/picture">
-            <wp:extent cx="5943600" cy="3536091"/>
+            <wp:extent cx="5943600" cy="3544459"/>
             <wp:docPr id="4" name="Picture 4"/>
             <wp:cNvGraphicFramePr>
               <a:graphicFrameLocks noChangeAspect="1"/>
@@ -3286,7 +3313,7 @@
                   <pic:spPr>
                     <a:xfrm>
                       <a:off x="0" y="0"/>
-                      <a:ext cx="5943600" cy="3536091"/>
+                      <a:ext cx="5943600" cy="3544459"/>
                     </a:xfrm>
                     <a:prstGeom prst="rect"/>
                   </pic:spPr>
@@ -3339,7 +3366,7 @@
       <w:r>
         <w:drawing>
           <wp:inline xmlns:a="http://schemas.openxmlformats.org/drawingml/2006/main" xmlns:pic="http://schemas.openxmlformats.org/drawingml/2006/picture">
-            <wp:extent cx="5943600" cy="3536091"/>
+            <wp:extent cx="5943600" cy="3544459"/>
             <wp:docPr id="5" name="Picture 5"/>
             <wp:cNvGraphicFramePr>
               <a:graphicFrameLocks noChangeAspect="1"/>
@@ -3360,7 +3387,7 @@
                   <pic:spPr>
                     <a:xfrm>
                       <a:off x="0" y="0"/>
-                      <a:ext cx="5943600" cy="3536091"/>
+                      <a:ext cx="5943600" cy="3544459"/>
                     </a:xfrm>
                     <a:prstGeom prst="rect"/>
                   </pic:spPr>
@@ -3418,7 +3445,7 @@
       <w:r>
         <w:drawing>
           <wp:inline xmlns:a="http://schemas.openxmlformats.org/drawingml/2006/main" xmlns:pic="http://schemas.openxmlformats.org/drawingml/2006/picture">
-            <wp:extent cx="5943600" cy="3536091"/>
+            <wp:extent cx="5943600" cy="3544459"/>
             <wp:docPr id="6" name="Picture 6"/>
             <wp:cNvGraphicFramePr>
               <a:graphicFrameLocks noChangeAspect="1"/>
@@ -3439,7 +3466,7 @@
                   <pic:spPr>
                     <a:xfrm>
                       <a:off x="0" y="0"/>
-                      <a:ext cx="5943600" cy="3536091"/>
+                      <a:ext cx="5943600" cy="3544459"/>
                     </a:xfrm>
                     <a:prstGeom prst="rect"/>
                   </pic:spPr>

</xml_diff>